<commit_message>
Content and CVs Improvement
</commit_message>
<xml_diff>
--- a/public/cv/Ahmed_Aziz_Mhiri_CV_ATS.docx
+++ b/public/cv/Ahmed_Aziz_Mhiri_CV_ATS.docx
@@ -4,220 +4,118 @@
   <w:body>
     <w:p>
       <w:pPr>
-        <w:spacing w:after="40"/>
-        <w:jc w:val="left"/>
+        <w:spacing w:before="0" w:after="0" w:line="240" w:lineRule="auto"/>
+        <w:jc w:val="center"/>
       </w:pPr>
       <w:r>
         <w:rPr>
-          <w:rFonts w:ascii="Arial" w:hAnsi="Arial" w:eastAsia="Arial"/>
+          <w:rFonts w:ascii="Arial" w:hAnsi="Arial" w:eastAsia="Arial" w:cs="Arial"/>
           <w:b/>
-          <w:color w:val="0D1B2F"/>
-          <w:sz w:val="43"/>
+          <w:color w:val="1E1E1E"/>
+          <w:sz w:val="37"/>
         </w:rPr>
         <w:t>AHMED AZIZ MHIRI</w:t>
       </w:r>
     </w:p>
     <w:p>
       <w:pPr>
-        <w:spacing w:after="40"/>
+        <w:spacing w:before="20" w:after="0" w:line="240" w:lineRule="auto"/>
+        <w:jc w:val="center"/>
       </w:pPr>
       <w:r>
         <w:rPr>
-          <w:rFonts w:ascii="Arial" w:hAnsi="Arial" w:eastAsia="Arial"/>
+          <w:rFonts w:ascii="Arial" w:hAnsi="Arial" w:eastAsia="Arial" w:cs="Arial"/>
           <w:b/>
-          <w:color w:val="B85E25"/>
+          <w:color w:val="1E1E1E"/>
           <w:sz w:val="19"/>
         </w:rPr>
-        <w:t>Marketing Analyst | Commercial Analyst | Business Intelligence Analyst | Digital Marketing Analyst | Revenue Operations Analyst | Process Automation Analyst | Junior Business Analyst</w:t>
+        <w:t>Marketing Analytics | Commercial Analytics | Business Intelligence | Process Automation</w:t>
       </w:r>
     </w:p>
     <w:p>
       <w:pPr>
-        <w:spacing w:after="20"/>
+        <w:spacing w:before="20" w:after="0" w:line="240" w:lineRule="auto"/>
+        <w:jc w:val="center"/>
       </w:pPr>
       <w:r>
         <w:rPr>
-          <w:rFonts w:ascii="Arial" w:hAnsi="Arial" w:eastAsia="Arial"/>
-          <w:b w:val="0"/>
-          <w:color w:val="58687B"/>
-          <w:sz w:val="16"/>
+          <w:rFonts w:ascii="Arial" w:hAnsi="Arial" w:eastAsia="Arial" w:cs="Arial"/>
+          <w:color w:val="1E1E1E"/>
+          <w:sz w:val="17"/>
         </w:rPr>
-        <w:t>Sousse, Tunisia | mhiriaziz13@gmail.com | linkedin.com/in/ahmed-aziz-mhiri</w:t>
-      </w:r>
-    </w:p>
-    <w:p>
-      <w:pPr>
-        <w:spacing w:after="60"/>
-      </w:pPr>
-      <w:r>
-        <w:rPr>
-          <w:rFonts w:ascii="Arial" w:hAnsi="Arial" w:eastAsia="Arial"/>
-          <w:b/>
-          <w:color w:val="58687B"/>
-          <w:sz w:val="16"/>
-        </w:rPr>
-        <w:t>Available for Europe-based opportunities from Summer 2027</w:t>
+        <w:t>Sousse, Tunisia  |  mhiriaziz13@gmail.com  |  linkedin.com/in/ahmed-aziz-mhiri  |  Available from Summer 2027</w:t>
       </w:r>
     </w:p>
     <w:p>
       <w:pPr>
         <w:keepNext/>
-        <w:spacing w:before="160" w:after="60"/>
-        <w:pBdr>
-          <w:bottom w:val="single" w:sz="9" w:space="2" w:color="B85E25"/>
-        </w:pBdr>
+        <w:spacing w:before="100" w:after="20" w:line="240" w:lineRule="auto"/>
       </w:pPr>
       <w:r>
         <w:rPr>
-          <w:rFonts w:ascii="Arial" w:hAnsi="Arial" w:eastAsia="Arial"/>
+          <w:rFonts w:ascii="Arial" w:hAnsi="Arial" w:eastAsia="Arial" w:cs="Arial"/>
           <w:b/>
           <w:caps/>
-          <w:color w:val="0D1B2F"/>
-          <w:sz w:val="19"/>
+          <w:color w:val="1E1E1E"/>
+          <w:sz w:val="21"/>
         </w:rPr>
         <w:t>PROFESSIONAL SUMMARY</w:t>
       </w:r>
     </w:p>
     <w:p>
       <w:pPr>
-        <w:spacing w:after="40"/>
+        <w:spacing w:before="0" w:after="0" w:line="240" w:lineRule="auto"/>
       </w:pPr>
       <w:r>
         <w:rPr>
-          <w:rFonts w:ascii="Arial" w:hAnsi="Arial" w:eastAsia="Arial"/>
-          <w:b w:val="0"/>
-          <w:color w:val="0D1B2F"/>
+          <w:rFonts w:ascii="Arial" w:hAnsi="Arial" w:eastAsia="Arial" w:cs="Arial"/>
+          <w:color w:val="1E1E1E"/>
           <w:sz w:val="17"/>
         </w:rPr>
-        <w:t>Master’s student in Big Data Analytics &amp; E-Commerce with a Business Intelligence background. Brings experience across marketing analytics, commercial analytics, KPI analysis, digital marketing, local SEO, customer journey improvement, process automation, financial reporting and AI-enabled application development. Interested in roles that connect data, operations, customer signals and commercial performance.</w:t>
+        <w:t>Master's student in Big Data Analytics &amp; E-Commerce with Business Intelligence, marketing analytics, commercial analysis, digital marketing, process automation and full-stack project experience. Skilled in analysing business and customer data, supporting KPI reporting, improving customer journeys, automating workflows and translating operational requirements into structured solutions. Target roles include Marketing Analyst, Commercial Analyst, Business Intelligence Analyst, Digital Marketing Analyst, Revenue Operations Analyst, Process Automation Analyst and Junior Business Analyst.</w:t>
       </w:r>
     </w:p>
     <w:p>
       <w:pPr>
         <w:keepNext/>
-        <w:spacing w:before="160" w:after="60"/>
-        <w:pBdr>
-          <w:bottom w:val="single" w:sz="9" w:space="2" w:color="B85E25"/>
-        </w:pBdr>
+        <w:spacing w:before="100" w:after="20" w:line="240" w:lineRule="auto"/>
       </w:pPr>
       <w:r>
         <w:rPr>
-          <w:rFonts w:ascii="Arial" w:hAnsi="Arial" w:eastAsia="Arial"/>
+          <w:rFonts w:ascii="Arial" w:hAnsi="Arial" w:eastAsia="Arial" w:cs="Arial"/>
           <w:b/>
           <w:caps/>
-          <w:color w:val="0D1B2F"/>
-          <w:sz w:val="19"/>
+          <w:color w:val="1E1E1E"/>
+          <w:sz w:val="21"/>
         </w:rPr>
-        <w:t>CORE SKILLS</w:t>
+        <w:t>KEY SKILLS</w:t>
       </w:r>
     </w:p>
     <w:p>
       <w:pPr>
-        <w:spacing w:after="20"/>
+        <w:spacing w:before="0" w:after="0" w:line="240" w:lineRule="auto"/>
       </w:pPr>
       <w:r>
         <w:rPr>
-          <w:rFonts w:ascii="Arial" w:hAnsi="Arial" w:eastAsia="Arial"/>
-          <w:b/>
-          <w:color w:val="0D1B2F"/>
-          <w:sz w:val="16"/>
+          <w:rFonts w:ascii="Arial" w:hAnsi="Arial" w:eastAsia="Arial" w:cs="Arial"/>
+          <w:color w:val="1E1E1E"/>
+          <w:sz w:val="17"/>
         </w:rPr>
-        <w:t xml:space="preserve">Data &amp; Analytics: </w:t>
-      </w:r>
-      <w:r>
-        <w:rPr>
-          <w:rFonts w:ascii="Arial" w:hAnsi="Arial" w:eastAsia="Arial"/>
-          <w:b w:val="0"/>
-          <w:color w:val="0D1B2F"/>
-          <w:sz w:val="16"/>
-        </w:rPr>
-        <w:t>Data Analysis; Marketing Analytics; Commercial Analytics; Business Intelligence; KPI Analysis; Data Visualization; Financial Reporting; Excel</w:t>
-      </w:r>
-    </w:p>
-    <w:p>
-      <w:pPr>
-        <w:spacing w:after="20"/>
-      </w:pPr>
-      <w:r>
-        <w:rPr>
-          <w:rFonts w:ascii="Arial" w:hAnsi="Arial" w:eastAsia="Arial"/>
-          <w:b/>
-          <w:color w:val="0D1B2F"/>
-          <w:sz w:val="16"/>
-        </w:rPr>
-        <w:t xml:space="preserve">Marketing &amp; Growth: </w:t>
-      </w:r>
-      <w:r>
-        <w:rPr>
-          <w:rFonts w:ascii="Arial" w:hAnsi="Arial" w:eastAsia="Arial"/>
-          <w:b w:val="0"/>
-          <w:color w:val="0D1B2F"/>
-          <w:sz w:val="16"/>
-        </w:rPr>
-        <w:t>Digital Marketing; Customer Insights; Customer Journey; Local SEO; Email Marketing; Paid Social; Social Media Strategy; E-Commerce</w:t>
-      </w:r>
-    </w:p>
-    <w:p>
-      <w:pPr>
-        <w:spacing w:after="20"/>
-      </w:pPr>
-      <w:r>
-        <w:rPr>
-          <w:rFonts w:ascii="Arial" w:hAnsi="Arial" w:eastAsia="Arial"/>
-          <w:b/>
-          <w:color w:val="0D1B2F"/>
-          <w:sz w:val="16"/>
-        </w:rPr>
-        <w:t xml:space="preserve">Automation &amp; Technology: </w:t>
-      </w:r>
-      <w:r>
-        <w:rPr>
-          <w:rFonts w:ascii="Arial" w:hAnsi="Arial" w:eastAsia="Arial"/>
-          <w:b w:val="0"/>
-          <w:color w:val="0D1B2F"/>
-          <w:sz w:val="16"/>
-        </w:rPr>
-        <w:t>UiPath; Process Automation; Business Rules Automation; JSON; HTML Reporting; Angular; Spring Boot; REST APIs; RAG; Ollama; LLaMA 3.2</w:t>
-      </w:r>
-    </w:p>
-    <w:p>
-      <w:pPr>
-        <w:spacing w:after="20"/>
-      </w:pPr>
-      <w:r>
-        <w:rPr>
-          <w:rFonts w:ascii="Arial" w:hAnsi="Arial" w:eastAsia="Arial"/>
-          <w:b/>
-          <w:color w:val="0D1B2F"/>
-          <w:sz w:val="16"/>
-        </w:rPr>
-        <w:t xml:space="preserve">Business Strengths: </w:t>
-      </w:r>
-      <w:r>
-        <w:rPr>
-          <w:rFonts w:ascii="Arial" w:hAnsi="Arial" w:eastAsia="Arial"/>
-          <w:b w:val="0"/>
-          <w:color w:val="0D1B2F"/>
-          <w:sz w:val="16"/>
-        </w:rPr>
-        <w:t>Commercial Thinking; Problem Solving; Cross-Functional Collaboration; Process Improvement; Structured Communication</w:t>
+        <w:t>Marketing Analytics; Commercial Analytics; Business Intelligence; Data Analysis; KPI Analysis; Data Visualization; Financial Reporting; Excel; Digital Marketing; Customer Insights; Customer Journey; Local SEO; Email Marketing; Paid Social; E-Commerce; UiPath; Process Automation; Business Rules Automation; JSON; HTML Reporting; Angular; Spring Boot; REST APIs; RAG.</w:t>
       </w:r>
     </w:p>
     <w:p>
       <w:pPr>
         <w:keepNext/>
-        <w:spacing w:before="160" w:after="60"/>
-        <w:pBdr>
-          <w:bottom w:val="single" w:sz="9" w:space="2" w:color="B85E25"/>
-        </w:pBdr>
+        <w:spacing w:before="100" w:after="20" w:line="240" w:lineRule="auto"/>
       </w:pPr>
       <w:r>
         <w:rPr>
-          <w:rFonts w:ascii="Arial" w:hAnsi="Arial" w:eastAsia="Arial"/>
+          <w:rFonts w:ascii="Arial" w:hAnsi="Arial" w:eastAsia="Arial" w:cs="Arial"/>
           <w:b/>
           <w:caps/>
-          <w:color w:val="0D1B2F"/>
-          <w:sz w:val="19"/>
+          <w:color w:val="1E1E1E"/>
+          <w:sz w:val="21"/>
         </w:rPr>
         <w:t>PROFESSIONAL EXPERIENCE</w:t>
       </w:r>
@@ -225,799 +123,578 @@
     <w:p>
       <w:pPr>
         <w:keepNext/>
-        <w:spacing w:before="80" w:after="20"/>
+        <w:spacing w:before="44" w:after="0" w:line="240" w:lineRule="auto"/>
       </w:pPr>
       <w:r>
         <w:rPr>
-          <w:rFonts w:ascii="Arial" w:hAnsi="Arial" w:eastAsia="Arial"/>
+          <w:rFonts w:ascii="Arial" w:hAnsi="Arial" w:eastAsia="Arial" w:cs="Arial"/>
           <w:b/>
-          <w:color w:val="0D1B2F"/>
+          <w:color w:val="1E1E1E"/>
           <w:sz w:val="18"/>
         </w:rPr>
-        <w:t>Head of IT Services - Process Automation &amp; Business Systems</w:t>
-      </w:r>
-      <w:r>
-        <w:rPr>
-          <w:rFonts w:ascii="Arial" w:hAnsi="Arial" w:eastAsia="Arial"/>
-          <w:b/>
-          <w:color w:val="0D1B2F"/>
-          <w:sz w:val="18"/>
-        </w:rPr>
-        <w:t xml:space="preserve"> | Sunshine Vacances France</w:t>
-      </w:r>
-      <w:r>
-        <w:rPr>
-          <w:rFonts w:ascii="Arial" w:hAnsi="Arial" w:eastAsia="Arial"/>
-          <w:b w:val="0"/>
-          <w:color w:val="58687B"/>
-          <w:sz w:val="15"/>
-        </w:rPr>
-        <w:t xml:space="preserve"> | July 2025 - Present | Sousse, Tunisia</w:t>
-      </w:r>
-    </w:p>
-    <w:p>
-      <w:pPr>
-        <w:spacing w:after="10" w:line="240" w:lineRule="auto"/>
-        <w:ind w:left="202" w:hanging="173"/>
-      </w:pPr>
-      <w:r>
-        <w:rPr>
-          <w:rFonts w:ascii="Arial" w:hAnsi="Arial" w:eastAsia="Arial"/>
-          <w:b/>
-          <w:color w:val="B85E25"/>
-          <w:sz w:val="16"/>
-        </w:rPr>
-        <w:t xml:space="preserve">- </w:t>
-      </w:r>
-      <w:r>
-        <w:rPr>
-          <w:rFonts w:ascii="Arial" w:hAnsi="Arial" w:eastAsia="Arial"/>
-          <w:b w:val="0"/>
-          <w:color w:val="0D1B2F"/>
-          <w:sz w:val="16"/>
-        </w:rPr>
-        <w:t>Designed and expanded RPA workflow for invoice validation and booking reconciliation using invoices, vouchers, reservations and stay-related data.</w:t>
-      </w:r>
-    </w:p>
-    <w:p>
-      <w:pPr>
-        <w:spacing w:after="10" w:line="240" w:lineRule="auto"/>
-        <w:ind w:left="202" w:hanging="173"/>
-      </w:pPr>
-      <w:r>
-        <w:rPr>
-          <w:rFonts w:ascii="Arial" w:hAnsi="Arial" w:eastAsia="Arial"/>
-          <w:b/>
-          <w:color w:val="B85E25"/>
-          <w:sz w:val="16"/>
-        </w:rPr>
-        <w:t xml:space="preserve">- </w:t>
-      </w:r>
-      <w:r>
-        <w:rPr>
-          <w:rFonts w:ascii="Arial" w:hAnsi="Arial" w:eastAsia="Arial"/>
-          <w:b w:val="0"/>
-          <w:color w:val="0D1B2F"/>
-          <w:sz w:val="16"/>
-        </w:rPr>
-        <w:t>Automated business rules covering room rates, board types, discounts, supplements and special offers.</w:t>
-      </w:r>
-    </w:p>
-    <w:p>
-      <w:pPr>
-        <w:spacing w:after="10" w:line="240" w:lineRule="auto"/>
-        <w:ind w:left="202" w:hanging="173"/>
-      </w:pPr>
-      <w:r>
-        <w:rPr>
-          <w:rFonts w:ascii="Arial" w:hAnsi="Arial" w:eastAsia="Arial"/>
-          <w:b/>
-          <w:color w:val="B85E25"/>
-          <w:sz w:val="16"/>
-        </w:rPr>
-        <w:t xml:space="preserve">- </w:t>
-      </w:r>
-      <w:r>
-        <w:rPr>
-          <w:rFonts w:ascii="Arial" w:hAnsi="Arial" w:eastAsia="Arial"/>
-          <w:b w:val="0"/>
-          <w:color w:val="0D1B2F"/>
-          <w:sz w:val="16"/>
-        </w:rPr>
-        <w:t>Generated JSON outputs and HTML reports for audit, review and operational follow-up; improved process traceability and reliability.</w:t>
+        <w:t>Sunshine Vacances France | Head of IT Services | Process Automation &amp; Business Systems</w:t>
       </w:r>
     </w:p>
     <w:p>
       <w:pPr>
         <w:keepNext/>
-        <w:spacing w:before="80" w:after="20"/>
+        <w:spacing w:before="0" w:after="0" w:line="240" w:lineRule="auto"/>
       </w:pPr>
       <w:r>
         <w:rPr>
-          <w:rFonts w:ascii="Arial" w:hAnsi="Arial" w:eastAsia="Arial"/>
-          <w:b/>
-          <w:color w:val="0D1B2F"/>
-          <w:sz w:val="18"/>
+          <w:rFonts w:ascii="Arial" w:hAnsi="Arial" w:eastAsia="Arial" w:cs="Arial"/>
+          <w:i/>
+          <w:color w:val="687789"/>
+          <w:sz w:val="17"/>
         </w:rPr>
-        <w:t>Commercial &amp; Digital Marketing Manager</w:t>
-      </w:r>
-      <w:r>
-        <w:rPr>
-          <w:rFonts w:ascii="Arial" w:hAnsi="Arial" w:eastAsia="Arial"/>
-          <w:b/>
-          <w:color w:val="0D1B2F"/>
-          <w:sz w:val="18"/>
-        </w:rPr>
-        <w:t xml:space="preserve"> | Maison Salina</w:t>
-      </w:r>
-      <w:r>
-        <w:rPr>
-          <w:rFonts w:ascii="Arial" w:hAnsi="Arial" w:eastAsia="Arial"/>
-          <w:b w:val="0"/>
-          <w:color w:val="58687B"/>
-          <w:sz w:val="15"/>
-        </w:rPr>
-        <w:t xml:space="preserve"> | April 2025 - September 2025 | Sousse, Tunisia</w:t>
+        <w:t>Jul 2025 - Present | Sousse, Tunisia</w:t>
       </w:r>
     </w:p>
     <w:p>
       <w:pPr>
-        <w:spacing w:after="10" w:line="240" w:lineRule="auto"/>
+        <w:spacing w:before="0" w:after="0" w:line="240" w:lineRule="auto"/>
         <w:ind w:left="202" w:hanging="173"/>
       </w:pPr>
       <w:r>
         <w:rPr>
-          <w:rFonts w:ascii="Arial" w:hAnsi="Arial" w:eastAsia="Arial"/>
-          <w:b/>
-          <w:color w:val="B85E25"/>
-          <w:sz w:val="16"/>
+          <w:rFonts w:ascii="Arial" w:hAnsi="Arial" w:eastAsia="Arial" w:cs="Arial"/>
+          <w:color w:val="1E1E1E"/>
+          <w:sz w:val="17"/>
         </w:rPr>
-        <w:t xml:space="preserve">- </w:t>
+        <w:t xml:space="preserve">• </w:t>
       </w:r>
       <w:r>
         <w:rPr>
-          <w:rFonts w:ascii="Arial" w:hAnsi="Arial" w:eastAsia="Arial"/>
-          <w:b w:val="0"/>
-          <w:color w:val="0D1B2F"/>
-          <w:sz w:val="16"/>
+          <w:rFonts w:ascii="Arial" w:hAnsi="Arial" w:eastAsia="Arial" w:cs="Arial"/>
+          <w:color w:val="1E1E1E"/>
+          <w:sz w:val="17"/>
         </w:rPr>
-        <w:t>Developed digital marketing initiatives aligned with commercial objectives and brand positioning.</w:t>
+        <w:t>Led business-process improvement initiatives for tourism operations, with a focus on automation, data reliability and auditability.</w:t>
       </w:r>
     </w:p>
     <w:p>
       <w:pPr>
-        <w:spacing w:after="10" w:line="240" w:lineRule="auto"/>
+        <w:spacing w:before="0" w:after="0" w:line="240" w:lineRule="auto"/>
         <w:ind w:left="202" w:hanging="173"/>
       </w:pPr>
       <w:r>
         <w:rPr>
-          <w:rFonts w:ascii="Arial" w:hAnsi="Arial" w:eastAsia="Arial"/>
-          <w:b/>
-          <w:color w:val="B85E25"/>
-          <w:sz w:val="16"/>
+          <w:rFonts w:ascii="Arial" w:hAnsi="Arial" w:eastAsia="Arial" w:cs="Arial"/>
+          <w:color w:val="1E1E1E"/>
+          <w:sz w:val="17"/>
         </w:rPr>
-        <w:t xml:space="preserve">- </w:t>
+        <w:t xml:space="preserve">• </w:t>
       </w:r>
       <w:r>
         <w:rPr>
-          <w:rFonts w:ascii="Arial" w:hAnsi="Arial" w:eastAsia="Arial"/>
-          <w:b w:val="0"/>
-          <w:color w:val="0D1B2F"/>
-          <w:sz w:val="16"/>
+          <w:rFonts w:ascii="Arial" w:hAnsi="Arial" w:eastAsia="Arial" w:cs="Arial"/>
+          <w:color w:val="1E1E1E"/>
+          <w:sz w:val="17"/>
         </w:rPr>
-        <w:t>Supported digital presence, customer-facing communication, strategic collaborations and monitoring of commercial priorities.</w:t>
+        <w:t>Designed and expanded a UiPath workflow for invoice validation and reconciliation across invoices, vouchers, reservations and stay-related data.</w:t>
       </w:r>
     </w:p>
     <w:p>
       <w:pPr>
         <w:keepNext/>
-        <w:spacing w:before="80" w:after="20"/>
+        <w:spacing w:before="44" w:after="0" w:line="240" w:lineRule="auto"/>
       </w:pPr>
       <w:r>
         <w:rPr>
-          <w:rFonts w:ascii="Arial" w:hAnsi="Arial" w:eastAsia="Arial"/>
+          <w:rFonts w:ascii="Arial" w:hAnsi="Arial" w:eastAsia="Arial" w:cs="Arial"/>
           <w:b/>
-          <w:color w:val="0D1B2F"/>
+          <w:color w:val="1E1E1E"/>
           <w:sz w:val="18"/>
         </w:rPr>
-        <w:t>Digital Marketing &amp; Automation Consultant</w:t>
-      </w:r>
-      <w:r>
-        <w:rPr>
-          <w:rFonts w:ascii="Arial" w:hAnsi="Arial" w:eastAsia="Arial"/>
-          <w:b/>
-          <w:color w:val="0D1B2F"/>
-          <w:sz w:val="18"/>
-        </w:rPr>
-        <w:t xml:space="preserve"> | Confidential Client - Men’s Barbershop</w:t>
-      </w:r>
-      <w:r>
-        <w:rPr>
-          <w:rFonts w:ascii="Arial" w:hAnsi="Arial" w:eastAsia="Arial"/>
-          <w:b w:val="0"/>
-          <w:color w:val="58687B"/>
-          <w:sz w:val="15"/>
-        </w:rPr>
-        <w:t xml:space="preserve"> | February 2025 - July 2025 | Noisy-le-Grand, France</w:t>
-      </w:r>
-    </w:p>
-    <w:p>
-      <w:pPr>
-        <w:spacing w:after="10" w:line="240" w:lineRule="auto"/>
-        <w:ind w:left="202" w:hanging="173"/>
-      </w:pPr>
-      <w:r>
-        <w:rPr>
-          <w:rFonts w:ascii="Arial" w:hAnsi="Arial" w:eastAsia="Arial"/>
-          <w:b/>
-          <w:color w:val="B85E25"/>
-          <w:sz w:val="16"/>
-        </w:rPr>
-        <w:t xml:space="preserve">- </w:t>
-      </w:r>
-      <w:r>
-        <w:rPr>
-          <w:rFonts w:ascii="Arial" w:hAnsi="Arial" w:eastAsia="Arial"/>
-          <w:b w:val="0"/>
-          <w:color w:val="0D1B2F"/>
-          <w:sz w:val="16"/>
-        </w:rPr>
-        <w:t>Built and managed a website with online booking and activity monitoring.</w:t>
-      </w:r>
-    </w:p>
-    <w:p>
-      <w:pPr>
-        <w:spacing w:after="10" w:line="240" w:lineRule="auto"/>
-        <w:ind w:left="202" w:hanging="173"/>
-      </w:pPr>
-      <w:r>
-        <w:rPr>
-          <w:rFonts w:ascii="Arial" w:hAnsi="Arial" w:eastAsia="Arial"/>
-          <w:b/>
-          <w:color w:val="B85E25"/>
-          <w:sz w:val="16"/>
-        </w:rPr>
-        <w:t xml:space="preserve">- </w:t>
-      </w:r>
-      <w:r>
-        <w:rPr>
-          <w:rFonts w:ascii="Arial" w:hAnsi="Arial" w:eastAsia="Arial"/>
-          <w:b w:val="0"/>
-          <w:color w:val="0D1B2F"/>
-          <w:sz w:val="16"/>
-        </w:rPr>
-        <w:t>Supported local SEO, social content, paid social, reviews, email marketing and customer communication.</w:t>
-      </w:r>
-    </w:p>
-    <w:p>
-      <w:pPr>
-        <w:spacing w:after="10" w:line="240" w:lineRule="auto"/>
-        <w:ind w:left="202" w:hanging="173"/>
-      </w:pPr>
-      <w:r>
-        <w:rPr>
-          <w:rFonts w:ascii="Arial" w:hAnsi="Arial" w:eastAsia="Arial"/>
-          <w:b/>
-          <w:color w:val="B85E25"/>
-          <w:sz w:val="16"/>
-        </w:rPr>
-        <w:t xml:space="preserve">- </w:t>
-      </w:r>
-      <w:r>
-        <w:rPr>
-          <w:rFonts w:ascii="Arial" w:hAnsi="Arial" w:eastAsia="Arial"/>
-          <w:b w:val="0"/>
-          <w:color w:val="0D1B2F"/>
-          <w:sz w:val="16"/>
-        </w:rPr>
-        <w:t>Facilitated Planity partnership to streamline booking operations and improve customer journey.</w:t>
+        <w:t>Maison Salina | Commercial &amp; Digital Marketing Manager</w:t>
       </w:r>
     </w:p>
     <w:p>
       <w:pPr>
         <w:keepNext/>
-        <w:spacing w:before="80" w:after="20"/>
+        <w:spacing w:before="0" w:after="0" w:line="240" w:lineRule="auto"/>
       </w:pPr>
       <w:r>
         <w:rPr>
-          <w:rFonts w:ascii="Arial" w:hAnsi="Arial" w:eastAsia="Arial"/>
-          <w:b/>
-          <w:color w:val="0D1B2F"/>
-          <w:sz w:val="18"/>
+          <w:rFonts w:ascii="Arial" w:hAnsi="Arial" w:eastAsia="Arial" w:cs="Arial"/>
+          <w:i/>
+          <w:color w:val="687789"/>
+          <w:sz w:val="17"/>
         </w:rPr>
-        <w:t>AI &amp; Full-Stack Development Intern</w:t>
-      </w:r>
-      <w:r>
-        <w:rPr>
-          <w:rFonts w:ascii="Arial" w:hAnsi="Arial" w:eastAsia="Arial"/>
-          <w:b/>
-          <w:color w:val="0D1B2F"/>
-          <w:sz w:val="18"/>
-        </w:rPr>
-        <w:t xml:space="preserve"> | VERMEG for Banking &amp; Insurance Software</w:t>
-      </w:r>
-      <w:r>
-        <w:rPr>
-          <w:rFonts w:ascii="Arial" w:hAnsi="Arial" w:eastAsia="Arial"/>
-          <w:b w:val="0"/>
-          <w:color w:val="58687B"/>
-          <w:sz w:val="15"/>
-        </w:rPr>
-        <w:t xml:space="preserve"> | February 2025 - May 2025 | Tunis, Tunisia</w:t>
+        <w:t>Apr 2025 - Sep 2025 | Sousse, Tunisia</w:t>
       </w:r>
     </w:p>
     <w:p>
       <w:pPr>
-        <w:spacing w:after="10" w:line="240" w:lineRule="auto"/>
+        <w:spacing w:before="0" w:after="0" w:line="240" w:lineRule="auto"/>
         <w:ind w:left="202" w:hanging="173"/>
       </w:pPr>
       <w:r>
         <w:rPr>
-          <w:rFonts w:ascii="Arial" w:hAnsi="Arial" w:eastAsia="Arial"/>
-          <w:b/>
-          <w:color w:val="B85E25"/>
-          <w:sz w:val="16"/>
+          <w:rFonts w:ascii="Arial" w:hAnsi="Arial" w:eastAsia="Arial" w:cs="Arial"/>
+          <w:color w:val="1E1E1E"/>
+          <w:sz w:val="17"/>
         </w:rPr>
-        <w:t xml:space="preserve">- </w:t>
+        <w:t xml:space="preserve">• </w:t>
       </w:r>
       <w:r>
         <w:rPr>
-          <w:rFonts w:ascii="Arial" w:hAnsi="Arial" w:eastAsia="Arial"/>
-          <w:b w:val="0"/>
-          <w:color w:val="0D1B2F"/>
-          <w:sz w:val="16"/>
+          <w:rFonts w:ascii="Arial" w:hAnsi="Arial" w:eastAsia="Arial" w:cs="Arial"/>
+          <w:color w:val="1E1E1E"/>
+          <w:sz w:val="17"/>
         </w:rPr>
-        <w:t>Developed e-learning platform features: enrolment, progress tracking, dashboards, event booking and real-time notifications.</w:t>
-      </w:r>
-    </w:p>
-    <w:p>
-      <w:pPr>
-        <w:spacing w:after="10" w:line="240" w:lineRule="auto"/>
-        <w:ind w:left="202" w:hanging="173"/>
-      </w:pPr>
-      <w:r>
-        <w:rPr>
-          <w:rFonts w:ascii="Arial" w:hAnsi="Arial" w:eastAsia="Arial"/>
-          <w:b/>
-          <w:color w:val="B85E25"/>
-          <w:sz w:val="16"/>
-        </w:rPr>
-        <w:t xml:space="preserve">- </w:t>
-      </w:r>
-      <w:r>
-        <w:rPr>
-          <w:rFonts w:ascii="Arial" w:hAnsi="Arial" w:eastAsia="Arial"/>
-          <w:b w:val="0"/>
-          <w:color w:val="0D1B2F"/>
-          <w:sz w:val="16"/>
-        </w:rPr>
-        <w:t>Integrated locally deployed LLaMA 3.2 assistant through Ollama with RAG retrieval for PDF and CSV knowledge.</w:t>
-      </w:r>
-    </w:p>
-    <w:p>
-      <w:pPr>
-        <w:spacing w:after="10" w:line="240" w:lineRule="auto"/>
-        <w:ind w:left="202" w:hanging="173"/>
-      </w:pPr>
-      <w:r>
-        <w:rPr>
-          <w:rFonts w:ascii="Arial" w:hAnsi="Arial" w:eastAsia="Arial"/>
-          <w:b/>
-          <w:color w:val="B85E25"/>
-          <w:sz w:val="16"/>
-        </w:rPr>
-        <w:t xml:space="preserve">- </w:t>
-      </w:r>
-      <w:r>
-        <w:rPr>
-          <w:rFonts w:ascii="Arial" w:hAnsi="Arial" w:eastAsia="Arial"/>
-          <w:b w:val="0"/>
-          <w:color w:val="0D1B2F"/>
-          <w:sz w:val="16"/>
-        </w:rPr>
-        <w:t>Contributed to microservices, secure user management, monitoring and AI security controls.</w:t>
+        <w:t>Led commercial and digital initiatives for a long-established home-furnishing business, supporting visibility, customer engagement and growth.</w:t>
       </w:r>
     </w:p>
     <w:p>
       <w:pPr>
         <w:keepNext/>
-        <w:spacing w:before="80" w:after="20"/>
+        <w:spacing w:before="44" w:after="0" w:line="240" w:lineRule="auto"/>
       </w:pPr>
       <w:r>
         <w:rPr>
-          <w:rFonts w:ascii="Arial" w:hAnsi="Arial" w:eastAsia="Arial"/>
+          <w:rFonts w:ascii="Arial" w:hAnsi="Arial" w:eastAsia="Arial" w:cs="Arial"/>
           <w:b/>
-          <w:color w:val="0D1B2F"/>
+          <w:color w:val="1E1E1E"/>
           <w:sz w:val="18"/>
         </w:rPr>
-        <w:t>Management Controller</w:t>
-      </w:r>
-      <w:r>
-        <w:rPr>
-          <w:rFonts w:ascii="Arial" w:hAnsi="Arial" w:eastAsia="Arial"/>
-          <w:b/>
-          <w:color w:val="0D1B2F"/>
-          <w:sz w:val="18"/>
-        </w:rPr>
-        <w:t xml:space="preserve"> | El Mouradi Hotels - El Mouradi Kantaoui Club</w:t>
-      </w:r>
-      <w:r>
-        <w:rPr>
-          <w:rFonts w:ascii="Arial" w:hAnsi="Arial" w:eastAsia="Arial"/>
-          <w:b w:val="0"/>
-          <w:color w:val="58687B"/>
-          <w:sz w:val="15"/>
-        </w:rPr>
-        <w:t xml:space="preserve"> | July 2024 - September 2024 | Sousse, Tunisia</w:t>
-      </w:r>
-    </w:p>
-    <w:p>
-      <w:pPr>
-        <w:spacing w:after="10" w:line="240" w:lineRule="auto"/>
-        <w:ind w:left="202" w:hanging="173"/>
-      </w:pPr>
-      <w:r>
-        <w:rPr>
-          <w:rFonts w:ascii="Arial" w:hAnsi="Arial" w:eastAsia="Arial"/>
-          <w:b/>
-          <w:color w:val="B85E25"/>
-          <w:sz w:val="16"/>
-        </w:rPr>
-        <w:t xml:space="preserve">- </w:t>
-      </w:r>
-      <w:r>
-        <w:rPr>
-          <w:rFonts w:ascii="Arial" w:hAnsi="Arial" w:eastAsia="Arial"/>
-          <w:b w:val="0"/>
-          <w:color w:val="0D1B2F"/>
-          <w:sz w:val="16"/>
-        </w:rPr>
-        <w:t>Analysed occupancy, operational cost and revenue KPIs; contributed to budgeting, variance analysis, management reporting and cost-control opportunities.</w:t>
+        <w:t>Confidential Client - Men's Barbershop, France | Digital Marketing &amp; Automation Consultant</w:t>
       </w:r>
     </w:p>
     <w:p>
       <w:pPr>
         <w:keepNext/>
-        <w:spacing w:before="80" w:after="20"/>
+        <w:spacing w:before="0" w:after="0" w:line="240" w:lineRule="auto"/>
       </w:pPr>
       <w:r>
         <w:rPr>
-          <w:rFonts w:ascii="Arial" w:hAnsi="Arial" w:eastAsia="Arial"/>
-          <w:b/>
-          <w:color w:val="0D1B2F"/>
-          <w:sz w:val="18"/>
+          <w:rFonts w:ascii="Arial" w:hAnsi="Arial" w:eastAsia="Arial" w:cs="Arial"/>
+          <w:i/>
+          <w:color w:val="687789"/>
+          <w:sz w:val="17"/>
         </w:rPr>
-        <w:t>Full-Stack Development Intern</w:t>
-      </w:r>
-      <w:r>
-        <w:rPr>
-          <w:rFonts w:ascii="Arial" w:hAnsi="Arial" w:eastAsia="Arial"/>
-          <w:b/>
-          <w:color w:val="0D1B2F"/>
-          <w:sz w:val="18"/>
-        </w:rPr>
-        <w:t xml:space="preserve"> | Arabsoft</w:t>
-      </w:r>
-      <w:r>
-        <w:rPr>
-          <w:rFonts w:ascii="Arial" w:hAnsi="Arial" w:eastAsia="Arial"/>
-          <w:b w:val="0"/>
-          <w:color w:val="58687B"/>
-          <w:sz w:val="15"/>
-        </w:rPr>
-        <w:t xml:space="preserve"> | June 2024 - August 2024 | Tunis, Tunisia</w:t>
+        <w:t>Feb 2025 - Jul 2025 | Noisy-le-Grand, France</w:t>
       </w:r>
     </w:p>
     <w:p>
       <w:pPr>
-        <w:spacing w:after="10" w:line="240" w:lineRule="auto"/>
+        <w:spacing w:before="0" w:after="0" w:line="240" w:lineRule="auto"/>
         <w:ind w:left="202" w:hanging="173"/>
       </w:pPr>
       <w:r>
         <w:rPr>
-          <w:rFonts w:ascii="Arial" w:hAnsi="Arial" w:eastAsia="Arial"/>
-          <w:b/>
-          <w:color w:val="B85E25"/>
-          <w:sz w:val="16"/>
+          <w:rFonts w:ascii="Arial" w:hAnsi="Arial" w:eastAsia="Arial" w:cs="Arial"/>
+          <w:color w:val="1E1E1E"/>
+          <w:sz w:val="17"/>
         </w:rPr>
-        <w:t xml:space="preserve">- </w:t>
+        <w:t xml:space="preserve">• </w:t>
       </w:r>
       <w:r>
         <w:rPr>
-          <w:rFonts w:ascii="Arial" w:hAnsi="Arial" w:eastAsia="Arial"/>
-          <w:b w:val="0"/>
-          <w:color w:val="0D1B2F"/>
-          <w:sz w:val="16"/>
+          <w:rFonts w:ascii="Arial" w:hAnsi="Arial" w:eastAsia="Arial" w:cs="Arial"/>
+          <w:color w:val="1E1E1E"/>
+          <w:sz w:val="17"/>
         </w:rPr>
-        <w:t>Designed Angular user interface and Spring Boot REST APIs for management of books, users and borrowing operations.</w:t>
+        <w:t>Led a digital transformation project focused on online visibility, booking experience and digital customer communication.</w:t>
       </w:r>
     </w:p>
     <w:p>
       <w:pPr>
         <w:keepNext/>
-        <w:spacing w:before="80" w:after="20"/>
+        <w:spacing w:before="44" w:after="0" w:line="240" w:lineRule="auto"/>
       </w:pPr>
       <w:r>
         <w:rPr>
-          <w:rFonts w:ascii="Arial" w:hAnsi="Arial" w:eastAsia="Arial"/>
+          <w:rFonts w:ascii="Arial" w:hAnsi="Arial" w:eastAsia="Arial" w:cs="Arial"/>
           <w:b/>
-          <w:color w:val="0D1B2F"/>
+          <w:color w:val="1E1E1E"/>
           <w:sz w:val="18"/>
         </w:rPr>
-        <w:t>Management Control Intern</w:t>
-      </w:r>
-      <w:r>
-        <w:rPr>
-          <w:rFonts w:ascii="Arial" w:hAnsi="Arial" w:eastAsia="Arial"/>
-          <w:b/>
-          <w:color w:val="0D1B2F"/>
-          <w:sz w:val="18"/>
-        </w:rPr>
-        <w:t xml:space="preserve"> | El Mouradi Hotels - El Mouradi Palace</w:t>
-      </w:r>
-      <w:r>
-        <w:rPr>
-          <w:rFonts w:ascii="Arial" w:hAnsi="Arial" w:eastAsia="Arial"/>
-          <w:b w:val="0"/>
-          <w:color w:val="58687B"/>
-          <w:sz w:val="15"/>
-        </w:rPr>
-        <w:t xml:space="preserve"> | June 2023 - September 2023 | Sousse, Tunisia</w:t>
-      </w:r>
-    </w:p>
-    <w:p>
-      <w:pPr>
-        <w:spacing w:after="10" w:line="240" w:lineRule="auto"/>
-        <w:ind w:left="202" w:hanging="173"/>
-      </w:pPr>
-      <w:r>
-        <w:rPr>
-          <w:rFonts w:ascii="Arial" w:hAnsi="Arial" w:eastAsia="Arial"/>
-          <w:b/>
-          <w:color w:val="B85E25"/>
-          <w:sz w:val="16"/>
-        </w:rPr>
-        <w:t xml:space="preserve">- </w:t>
-      </w:r>
-      <w:r>
-        <w:rPr>
-          <w:rFonts w:ascii="Arial" w:hAnsi="Arial" w:eastAsia="Arial"/>
-          <w:b w:val="0"/>
-          <w:color w:val="0D1B2F"/>
-          <w:sz w:val="16"/>
-        </w:rPr>
-        <w:t>Analysed expenses, operational indicators and budget variances; supported management reporting, cost control and KPI monitoring.</w:t>
+        <w:t>VERMEG for Banking &amp; Insurance Software | AI &amp; Full-Stack Development Intern</w:t>
       </w:r>
     </w:p>
     <w:p>
       <w:pPr>
         <w:keepNext/>
-        <w:spacing w:before="100" w:after="60"/>
-        <w:pBdr>
-          <w:bottom w:val="single" w:sz="9" w:space="2" w:color="B85E25"/>
-        </w:pBdr>
+        <w:spacing w:before="0" w:after="0" w:line="240" w:lineRule="auto"/>
       </w:pPr>
       <w:r>
         <w:rPr>
-          <w:rFonts w:ascii="Arial" w:hAnsi="Arial" w:eastAsia="Arial"/>
+          <w:rFonts w:ascii="Arial" w:hAnsi="Arial" w:eastAsia="Arial" w:cs="Arial"/>
+          <w:i/>
+          <w:color w:val="687789"/>
+          <w:sz w:val="17"/>
+        </w:rPr>
+        <w:t>Feb 2025 - May 2025 | Tunis, Tunisia</w:t>
+      </w:r>
+    </w:p>
+    <w:p>
+      <w:pPr>
+        <w:spacing w:before="0" w:after="0" w:line="240" w:lineRule="auto"/>
+        <w:ind w:left="202" w:hanging="173"/>
+      </w:pPr>
+      <w:r>
+        <w:rPr>
+          <w:rFonts w:ascii="Arial" w:hAnsi="Arial" w:eastAsia="Arial" w:cs="Arial"/>
+          <w:color w:val="1E1E1E"/>
+          <w:sz w:val="17"/>
+        </w:rPr>
+        <w:t xml:space="preserve">• </w:t>
+      </w:r>
+      <w:r>
+        <w:rPr>
+          <w:rFonts w:ascii="Arial" w:hAnsi="Arial" w:eastAsia="Arial" w:cs="Arial"/>
+          <w:color w:val="1E1E1E"/>
+          <w:sz w:val="17"/>
+        </w:rPr>
+        <w:t>Contributed to a secure, scalable and multilingual e-learning platform with enrolment, progress tracking, dashboards, event booking and real-time notifications.</w:t>
+      </w:r>
+    </w:p>
+    <w:p>
+      <w:pPr>
+        <w:spacing w:before="0" w:after="0" w:line="240" w:lineRule="auto"/>
+        <w:ind w:left="202" w:hanging="173"/>
+      </w:pPr>
+      <w:r>
+        <w:rPr>
+          <w:rFonts w:ascii="Arial" w:hAnsi="Arial" w:eastAsia="Arial" w:cs="Arial"/>
+          <w:color w:val="1E1E1E"/>
+          <w:sz w:val="17"/>
+        </w:rPr>
+        <w:t xml:space="preserve">• </w:t>
+      </w:r>
+      <w:r>
+        <w:rPr>
+          <w:rFonts w:ascii="Arial" w:hAnsi="Arial" w:eastAsia="Arial" w:cs="Arial"/>
+          <w:color w:val="1E1E1E"/>
+          <w:sz w:val="17"/>
+        </w:rPr>
+        <w:t>Integrated a locally deployed LLaMA 3.2 assistant through Ollama with RAG-based PDF and CSV knowledge retrieval; contributed to microservices, monitoring and security safeguards.</w:t>
+      </w:r>
+    </w:p>
+    <w:p>
+      <w:pPr>
+        <w:keepNext/>
+        <w:spacing w:before="44" w:after="0" w:line="240" w:lineRule="auto"/>
+      </w:pPr>
+      <w:r>
+        <w:rPr>
+          <w:rFonts w:ascii="Arial" w:hAnsi="Arial" w:eastAsia="Arial" w:cs="Arial"/>
+          <w:b/>
+          <w:color w:val="1E1E1E"/>
+          <w:sz w:val="18"/>
+        </w:rPr>
+        <w:t>El Mouradi Hotels | Management Controller</w:t>
+      </w:r>
+    </w:p>
+    <w:p>
+      <w:pPr>
+        <w:keepNext/>
+        <w:spacing w:before="0" w:after="0" w:line="240" w:lineRule="auto"/>
+      </w:pPr>
+      <w:r>
+        <w:rPr>
+          <w:rFonts w:ascii="Arial" w:hAnsi="Arial" w:eastAsia="Arial" w:cs="Arial"/>
+          <w:i/>
+          <w:color w:val="687789"/>
+          <w:sz w:val="17"/>
+        </w:rPr>
+        <w:t>Jul 2024 - Sep 2024 | Sousse, Tunisia</w:t>
+      </w:r>
+    </w:p>
+    <w:p>
+      <w:pPr>
+        <w:spacing w:before="0" w:after="0" w:line="240" w:lineRule="auto"/>
+        <w:ind w:left="202" w:hanging="173"/>
+      </w:pPr>
+      <w:r>
+        <w:rPr>
+          <w:rFonts w:ascii="Arial" w:hAnsi="Arial" w:eastAsia="Arial" w:cs="Arial"/>
+          <w:color w:val="1E1E1E"/>
+          <w:sz w:val="17"/>
+        </w:rPr>
+        <w:t xml:space="preserve">• </w:t>
+      </w:r>
+      <w:r>
+        <w:rPr>
+          <w:rFonts w:ascii="Arial" w:hAnsi="Arial" w:eastAsia="Arial" w:cs="Arial"/>
+          <w:color w:val="1E1E1E"/>
+          <w:sz w:val="17"/>
+        </w:rPr>
+        <w:t>Analysed occupancy, operational costs and revenue-related KPIs; contributed to budget preparation, variance analysis and financial reporting.</w:t>
+      </w:r>
+    </w:p>
+    <w:p>
+      <w:pPr>
+        <w:keepNext/>
+        <w:spacing w:before="44" w:after="0" w:line="240" w:lineRule="auto"/>
+      </w:pPr>
+      <w:r>
+        <w:rPr>
+          <w:rFonts w:ascii="Arial" w:hAnsi="Arial" w:eastAsia="Arial" w:cs="Arial"/>
+          <w:b/>
+          <w:color w:val="1E1E1E"/>
+          <w:sz w:val="18"/>
+        </w:rPr>
+        <w:t>ArabSoft | Full-Stack Development Intern</w:t>
+      </w:r>
+    </w:p>
+    <w:p>
+      <w:pPr>
+        <w:keepNext/>
+        <w:spacing w:before="0" w:after="0" w:line="240" w:lineRule="auto"/>
+      </w:pPr>
+      <w:r>
+        <w:rPr>
+          <w:rFonts w:ascii="Arial" w:hAnsi="Arial" w:eastAsia="Arial" w:cs="Arial"/>
+          <w:i/>
+          <w:color w:val="687789"/>
+          <w:sz w:val="17"/>
+        </w:rPr>
+        <w:t>Jun 2024 - Aug 2024 | Tunis, Tunisia</w:t>
+      </w:r>
+    </w:p>
+    <w:p>
+      <w:pPr>
+        <w:spacing w:before="0" w:after="0" w:line="240" w:lineRule="auto"/>
+        <w:ind w:left="202" w:hanging="173"/>
+      </w:pPr>
+      <w:r>
+        <w:rPr>
+          <w:rFonts w:ascii="Arial" w:hAnsi="Arial" w:eastAsia="Arial" w:cs="Arial"/>
+          <w:color w:val="1E1E1E"/>
+          <w:sz w:val="17"/>
+        </w:rPr>
+        <w:t xml:space="preserve">• </w:t>
+      </w:r>
+      <w:r>
+        <w:rPr>
+          <w:rFonts w:ascii="Arial" w:hAnsi="Arial" w:eastAsia="Arial" w:cs="Arial"/>
+          <w:color w:val="1E1E1E"/>
+          <w:sz w:val="17"/>
+        </w:rPr>
+        <w:t>Built a full-stack library-management application using Angular, Spring Boot, REST APIs and relational databases.</w:t>
+      </w:r>
+    </w:p>
+    <w:p>
+      <w:pPr>
+        <w:keepNext/>
+        <w:spacing w:before="44" w:after="0" w:line="240" w:lineRule="auto"/>
+      </w:pPr>
+      <w:r>
+        <w:rPr>
+          <w:rFonts w:ascii="Arial" w:hAnsi="Arial" w:eastAsia="Arial" w:cs="Arial"/>
+          <w:b/>
+          <w:color w:val="1E1E1E"/>
+          <w:sz w:val="18"/>
+        </w:rPr>
+        <w:t>El Mouradi Hotels | Management Control Intern</w:t>
+      </w:r>
+    </w:p>
+    <w:p>
+      <w:pPr>
+        <w:keepNext/>
+        <w:spacing w:before="0" w:after="0" w:line="240" w:lineRule="auto"/>
+      </w:pPr>
+      <w:r>
+        <w:rPr>
+          <w:rFonts w:ascii="Arial" w:hAnsi="Arial" w:eastAsia="Arial" w:cs="Arial"/>
+          <w:i/>
+          <w:color w:val="687789"/>
+          <w:sz w:val="17"/>
+        </w:rPr>
+        <w:t>Jun 2023 - Sep 2023 | Sousse, Tunisia</w:t>
+      </w:r>
+    </w:p>
+    <w:p>
+      <w:pPr>
+        <w:spacing w:before="0" w:after="0" w:line="240" w:lineRule="auto"/>
+        <w:ind w:left="202" w:hanging="173"/>
+      </w:pPr>
+      <w:r>
+        <w:rPr>
+          <w:rFonts w:ascii="Arial" w:hAnsi="Arial" w:eastAsia="Arial" w:cs="Arial"/>
+          <w:color w:val="1E1E1E"/>
+          <w:sz w:val="17"/>
+        </w:rPr>
+        <w:t xml:space="preserve">• </w:t>
+      </w:r>
+      <w:r>
+        <w:rPr>
+          <w:rFonts w:ascii="Arial" w:hAnsi="Arial" w:eastAsia="Arial" w:cs="Arial"/>
+          <w:color w:val="1E1E1E"/>
+          <w:sz w:val="17"/>
+        </w:rPr>
+        <w:t>Analysed expenses, operational indicators and budget variances; supported financial reporting, cost-control initiatives and KPI monitoring.</w:t>
+      </w:r>
+    </w:p>
+    <w:p>
+      <w:pPr>
+        <w:keepNext/>
+        <w:spacing w:before="100" w:after="20" w:line="240" w:lineRule="auto"/>
+      </w:pPr>
+      <w:r>
+        <w:rPr>
+          <w:rFonts w:ascii="Arial" w:hAnsi="Arial" w:eastAsia="Arial" w:cs="Arial"/>
           <w:b/>
           <w:caps/>
-          <w:color w:val="0D1B2F"/>
-          <w:sz w:val="19"/>
+          <w:color w:val="1E1E1E"/>
+          <w:sz w:val="21"/>
         </w:rPr>
         <w:t>SELECTED PROJECTS</w:t>
       </w:r>
     </w:p>
     <w:p>
       <w:pPr>
-        <w:spacing w:after="30"/>
-        <w:ind w:left="58"/>
+        <w:spacing w:before="0" w:after="0" w:line="240" w:lineRule="auto"/>
       </w:pPr>
       <w:r>
         <w:rPr>
-          <w:rFonts w:ascii="Arial" w:hAnsi="Arial" w:eastAsia="Arial"/>
+          <w:rFonts w:ascii="Arial" w:hAnsi="Arial" w:eastAsia="Arial" w:cs="Arial"/>
           <w:b/>
-          <w:color w:val="0D1B2F"/>
-          <w:sz w:val="16"/>
+          <w:color w:val="1E1E1E"/>
+          <w:sz w:val="17"/>
         </w:rPr>
-        <w:t xml:space="preserve">RPA for Invoice Control &amp; Booking Reconciliation - </w:t>
+        <w:t xml:space="preserve">RPA for Invoice Control &amp; Booking Reconciliation: </w:t>
       </w:r>
       <w:r>
         <w:rPr>
-          <w:rFonts w:ascii="Arial" w:hAnsi="Arial" w:eastAsia="Arial"/>
-          <w:b w:val="0"/>
-          <w:color w:val="0D1B2F"/>
-          <w:sz w:val="16"/>
+          <w:rFonts w:ascii="Arial" w:hAnsi="Arial" w:eastAsia="Arial" w:cs="Arial"/>
+          <w:color w:val="1E1E1E"/>
+          <w:sz w:val="17"/>
         </w:rPr>
-        <w:t>UiPath workflow for invoice and booking validation, commercial-rule automation, structured JSON and HTML audit reporting.</w:t>
+        <w:t>UiPath workflow that links invoice data, vouchers, reservations and business rules to create a more structured and auditable control process.</w:t>
       </w:r>
     </w:p>
     <w:p>
       <w:pPr>
-        <w:spacing w:after="30"/>
-        <w:ind w:left="58"/>
+        <w:spacing w:before="0" w:after="0" w:line="240" w:lineRule="auto"/>
       </w:pPr>
       <w:r>
         <w:rPr>
-          <w:rFonts w:ascii="Arial" w:hAnsi="Arial" w:eastAsia="Arial"/>
+          <w:rFonts w:ascii="Arial" w:hAnsi="Arial" w:eastAsia="Arial" w:cs="Arial"/>
           <w:b/>
-          <w:color w:val="0D1B2F"/>
-          <w:sz w:val="16"/>
+          <w:color w:val="1E1E1E"/>
+          <w:sz w:val="17"/>
         </w:rPr>
-        <w:t xml:space="preserve">Data-Driven Digital Transformation for a Men’s Barbershop - </w:t>
+        <w:t xml:space="preserve">Digital Transformation for a Men's Barbershop: </w:t>
       </w:r>
       <w:r>
         <w:rPr>
-          <w:rFonts w:ascii="Arial" w:hAnsi="Arial" w:eastAsia="Arial"/>
-          <w:b w:val="0"/>
-          <w:color w:val="0D1B2F"/>
-          <w:sz w:val="16"/>
+          <w:rFonts w:ascii="Arial" w:hAnsi="Arial" w:eastAsia="Arial" w:cs="Arial"/>
+          <w:color w:val="1E1E1E"/>
+          <w:sz w:val="17"/>
         </w:rPr>
-        <w:t>Website, booking journey, local SEO, social media, customer communication and activity monitoring.</w:t>
+        <w:t>Website, online booking, local SEO, social content and customer communication designed around a smoother digital journey.</w:t>
       </w:r>
     </w:p>
     <w:p>
       <w:pPr>
-        <w:spacing w:after="30"/>
-        <w:ind w:left="58"/>
+        <w:spacing w:before="0" w:after="0" w:line="240" w:lineRule="auto"/>
       </w:pPr>
       <w:r>
         <w:rPr>
-          <w:rFonts w:ascii="Arial" w:hAnsi="Arial" w:eastAsia="Arial"/>
+          <w:rFonts w:ascii="Arial" w:hAnsi="Arial" w:eastAsia="Arial" w:cs="Arial"/>
           <w:b/>
-          <w:color w:val="0D1B2F"/>
-          <w:sz w:val="16"/>
+          <w:color w:val="1E1E1E"/>
+          <w:sz w:val="17"/>
         </w:rPr>
-        <w:t xml:space="preserve">AI-Ready E-Learning Platform - </w:t>
+        <w:t xml:space="preserve">AI-Ready E-Learning Platform: </w:t>
       </w:r>
       <w:r>
         <w:rPr>
-          <w:rFonts w:ascii="Arial" w:hAnsi="Arial" w:eastAsia="Arial"/>
-          <w:b w:val="0"/>
-          <w:color w:val="0D1B2F"/>
-          <w:sz w:val="16"/>
+          <w:rFonts w:ascii="Arial" w:hAnsi="Arial" w:eastAsia="Arial" w:cs="Arial"/>
+          <w:color w:val="1E1E1E"/>
+          <w:sz w:val="17"/>
         </w:rPr>
-        <w:t>Angular, Spring Boot, Spring Cloud, Keycloak, Kafka, Ollama, RAG, monitoring and security tooling.</w:t>
+        <w:t>Secure, multilingual e-learning platform contribution with dashboards, microservices, local LLaMA 3.2 deployment and RAG-based knowledge retrieval.</w:t>
       </w:r>
     </w:p>
     <w:p>
       <w:pPr>
         <w:keepNext/>
-        <w:spacing w:before="160" w:after="60"/>
-        <w:pBdr>
-          <w:bottom w:val="single" w:sz="9" w:space="2" w:color="B85E25"/>
-        </w:pBdr>
+        <w:spacing w:before="100" w:after="20" w:line="240" w:lineRule="auto"/>
       </w:pPr>
       <w:r>
         <w:rPr>
-          <w:rFonts w:ascii="Arial" w:hAnsi="Arial" w:eastAsia="Arial"/>
+          <w:rFonts w:ascii="Arial" w:hAnsi="Arial" w:eastAsia="Arial" w:cs="Arial"/>
           <w:b/>
           <w:caps/>
-          <w:color w:val="0D1B2F"/>
-          <w:sz w:val="19"/>
+          <w:color w:val="1E1E1E"/>
+          <w:sz w:val="21"/>
         </w:rPr>
-        <w:t>EDUCATION</w:t>
+        <w:t>EDUCATION &amp; CERTIFICATION</w:t>
       </w:r>
     </w:p>
     <w:p>
       <w:pPr>
-        <w:spacing w:after="20"/>
+        <w:spacing w:before="0" w:after="0" w:line="240" w:lineRule="auto"/>
       </w:pPr>
       <w:r>
         <w:rPr>
-          <w:rFonts w:ascii="Arial" w:hAnsi="Arial" w:eastAsia="Arial"/>
-          <w:b/>
-          <w:color w:val="0D1B2F"/>
-          <w:sz w:val="16"/>
+          <w:rFonts w:ascii="Arial" w:hAnsi="Arial" w:eastAsia="Arial" w:cs="Arial"/>
+          <w:color w:val="1E1E1E"/>
+          <w:sz w:val="17"/>
         </w:rPr>
-        <w:t xml:space="preserve">Master’s Degree: </w:t>
-      </w:r>
-      <w:r>
-        <w:rPr>
-          <w:rFonts w:ascii="Arial" w:hAnsi="Arial" w:eastAsia="Arial"/>
-          <w:b w:val="0"/>
-          <w:color w:val="0D1B2F"/>
-          <w:sz w:val="16"/>
-        </w:rPr>
-        <w:t>Big Data Analytics &amp; E-Commerce, IHEC Carthage | October 2025 - June 2027 | Expected graduation: June 2027</w:t>
+        <w:t>Master's Degree - Big Data Analytics &amp; E-Commerce | IHEC Carthage | Oct 2025 - Jun 2027 | Expected graduation: June 2027</w:t>
       </w:r>
     </w:p>
     <w:p>
       <w:pPr>
-        <w:spacing w:after="20"/>
+        <w:spacing w:before="0" w:after="0" w:line="240" w:lineRule="auto"/>
       </w:pPr>
       <w:r>
         <w:rPr>
-          <w:rFonts w:ascii="Arial" w:hAnsi="Arial" w:eastAsia="Arial"/>
-          <w:b/>
-          <w:color w:val="0D1B2F"/>
-          <w:sz w:val="16"/>
+          <w:rFonts w:ascii="Arial" w:hAnsi="Arial" w:eastAsia="Arial" w:cs="Arial"/>
+          <w:color w:val="1E1E1E"/>
+          <w:sz w:val="17"/>
         </w:rPr>
-        <w:t xml:space="preserve">Bachelor’s Degree: </w:t>
-      </w:r>
-      <w:r>
-        <w:rPr>
-          <w:rFonts w:ascii="Arial" w:hAnsi="Arial" w:eastAsia="Arial"/>
-          <w:b w:val="0"/>
-          <w:color w:val="0D1B2F"/>
-          <w:sz w:val="16"/>
-        </w:rPr>
-        <w:t>Business Intelligence, IHEC Carthage | January 2021 - June 2025</w:t>
+        <w:t>Bachelor's Degree - Business Intelligence | IHEC Carthage | Jan 2021 - Jun 2025</w:t>
       </w:r>
     </w:p>
     <w:p>
       <w:pPr>
-        <w:keepNext/>
-        <w:spacing w:before="100" w:after="60"/>
-        <w:pBdr>
-          <w:bottom w:val="single" w:sz="9" w:space="2" w:color="B85E25"/>
-        </w:pBdr>
+        <w:spacing w:before="0" w:after="0" w:line="240" w:lineRule="auto"/>
       </w:pPr>
       <w:r>
         <w:rPr>
-          <w:rFonts w:ascii="Arial" w:hAnsi="Arial" w:eastAsia="Arial"/>
-          <w:b/>
-          <w:caps/>
-          <w:color w:val="0D1B2F"/>
-          <w:sz w:val="19"/>
+          <w:rFonts w:ascii="Arial" w:hAnsi="Arial" w:eastAsia="Arial" w:cs="Arial"/>
+          <w:color w:val="1E1E1E"/>
+          <w:sz w:val="17"/>
         </w:rPr>
-        <w:t>CERTIFICATION &amp; LANGUAGES</w:t>
-      </w:r>
-    </w:p>
-    <w:p>
-      <w:pPr>
-        <w:spacing w:after="20"/>
-      </w:pPr>
-      <w:r>
-        <w:rPr>
-          <w:rFonts w:ascii="Arial" w:hAnsi="Arial" w:eastAsia="Arial"/>
-          <w:b/>
-          <w:color w:val="0D1B2F"/>
-          <w:sz w:val="16"/>
-        </w:rPr>
-        <w:t xml:space="preserve">Certification: </w:t>
-      </w:r>
-      <w:r>
-        <w:rPr>
-          <w:rFonts w:ascii="Arial" w:hAnsi="Arial" w:eastAsia="Arial"/>
-          <w:b w:val="0"/>
-          <w:color w:val="0D1B2F"/>
-          <w:sz w:val="16"/>
-        </w:rPr>
-        <w:t>Fundamentals of Digital Marketing - Google</w:t>
-      </w:r>
-    </w:p>
-    <w:p>
-      <w:pPr>
-        <w:spacing w:after="20"/>
-      </w:pPr>
-      <w:r>
-        <w:rPr>
-          <w:rFonts w:ascii="Arial" w:hAnsi="Arial" w:eastAsia="Arial"/>
-          <w:b/>
-          <w:color w:val="0D1B2F"/>
-          <w:sz w:val="16"/>
-        </w:rPr>
-        <w:t xml:space="preserve">Languages: </w:t>
-      </w:r>
-      <w:r>
-        <w:rPr>
-          <w:rFonts w:ascii="Arial" w:hAnsi="Arial" w:eastAsia="Arial"/>
-          <w:b w:val="0"/>
-          <w:color w:val="0D1B2F"/>
-          <w:sz w:val="16"/>
-        </w:rPr>
-        <w:t>French | English</w:t>
+        <w:t>Certification: Fundamentals of Digital Marketing - Google | Languages: French, English</w:t>
       </w:r>
     </w:p>
     <w:sectPr>
-      <w:pgSz w:w="11909" w:h="16834"/>
-      <w:pgMar w:top="605" w:right="835" w:bottom="605" w:left="835" w:header="720" w:footer="720" w:gutter="0"/>
+      <w:headerReference w:type="default" r:id="rId9"/>
+      <w:footerReference w:type="default" r:id="rId10"/>
+      <w:pgSz w:w="12240" w:h="15840"/>
+      <w:pgMar w:top="562" w:right="778" w:bottom="490" w:left="778" w:header="230" w:footer="288" w:gutter="0"/>
       <w:cols w:space="720"/>
       <w:docGrid w:linePitch="360"/>
     </w:sectPr>
   </w:body>
 </w:document>
+</file>
+
+<file path=word/footer1.xml><?xml version="1.0" encoding="utf-8"?>
+<w:ftr xmlns:m="http://schemas.openxmlformats.org/officeDocument/2006/math" xmlns:mc="http://schemas.openxmlformats.org/markup-compatibility/2006" xmlns:mo="http://schemas.microsoft.com/office/mac/office/2008/main" xmlns:mv="urn:schemas-microsoft-com:mac:vml" xmlns:o="urn:schemas-microsoft-com:office:office" xmlns:r="http://schemas.openxmlformats.org/officeDocument/2006/relationships" xmlns:v="urn:schemas-microsoft-com:vml" xmlns:w10="urn:schemas-microsoft-com:office:word" xmlns:w14="http://schemas.microsoft.com/office/word/2010/wordml" xmlns:w="http://schemas.openxmlformats.org/wordprocessingml/2006/main" xmlns:wne="http://schemas.microsoft.com/office/word/2006/wordml" xmlns:wp14="http://schemas.microsoft.com/office/word/2010/wordprocessingDrawing" xmlns:wp="http://schemas.openxmlformats.org/drawingml/2006/wordprocessingDrawing" xmlns:wpc="http://schemas.microsoft.com/office/word/2010/wordprocessingCanvas" xmlns:wpg="http://schemas.microsoft.com/office/word/2010/wordprocessingGroup" xmlns:wpi="http://schemas.microsoft.com/office/word/2010/wordprocessingInk" xmlns:wps="http://schemas.microsoft.com/office/word/2010/wordprocessingShape" mc:Ignorable="w14 wp14">
+  <w:p>
+    <w:pPr>
+      <w:pStyle w:val="Footer"/>
+    </w:pPr>
+  </w:p>
+</w:ftr>
+</file>
+
+<file path=word/header1.xml><?xml version="1.0" encoding="utf-8"?>
+<w:hdr xmlns:m="http://schemas.openxmlformats.org/officeDocument/2006/math" xmlns:mc="http://schemas.openxmlformats.org/markup-compatibility/2006" xmlns:mo="http://schemas.microsoft.com/office/mac/office/2008/main" xmlns:mv="urn:schemas-microsoft-com:mac:vml" xmlns:o="urn:schemas-microsoft-com:office:office" xmlns:r="http://schemas.openxmlformats.org/officeDocument/2006/relationships" xmlns:v="urn:schemas-microsoft-com:vml" xmlns:w10="urn:schemas-microsoft-com:office:word" xmlns:w14="http://schemas.microsoft.com/office/word/2010/wordml" xmlns:w="http://schemas.openxmlformats.org/wordprocessingml/2006/main" xmlns:wne="http://schemas.microsoft.com/office/word/2006/wordml" xmlns:wp14="http://schemas.microsoft.com/office/word/2010/wordprocessingDrawing" xmlns:wp="http://schemas.openxmlformats.org/drawingml/2006/wordprocessingDrawing" xmlns:wpc="http://schemas.microsoft.com/office/word/2010/wordprocessingCanvas" xmlns:wpg="http://schemas.microsoft.com/office/word/2010/wordprocessingGroup" xmlns:wpi="http://schemas.microsoft.com/office/word/2010/wordprocessingInk" xmlns:wps="http://schemas.microsoft.com/office/word/2010/wordprocessingShape" mc:Ignorable="w14 wp14">
+  <w:p>
+    <w:pPr>
+      <w:pStyle w:val="Header"/>
+    </w:pPr>
+  </w:p>
+</w:hdr>
 </file>
 
 <file path=word/numbering.xml><?xml version="1.0" encoding="utf-8"?>
@@ -1384,12 +1061,12 @@
     <w:qFormat/>
     <w:rsid w:val="00FC693F"/>
     <w:pPr>
-      <w:spacing w:after="50" w:line="245" w:lineRule="auto"/>
+      <w:spacing w:after="0" w:line="240" w:lineRule="auto"/>
     </w:pPr>
     <w:rPr>
       <w:rFonts w:ascii="Arial" w:hAnsi="Arial" w:eastAsia="Arial"/>
-      <w:color w:val="0D1B2F"/>
-      <w:sz w:val="18"/>
+      <w:color w:val="1E1E1E"/>
+      <w:sz w:val="17"/>
     </w:rPr>
   </w:style>
   <w:style w:type="paragraph" w:styleId="Header">
@@ -1451,7 +1128,7 @@
       <w:outlineLvl w:val="0"/>
     </w:pPr>
     <w:rPr>
-      <w:rFonts w:asciiTheme="majorHAnsi" w:eastAsiaTheme="majorEastAsia" w:hAnsiTheme="majorHAnsi" w:cstheme="majorBidi" w:ascii="Arial" w:hAnsi="Arial" w:eastAsia="Arial"/>
+      <w:rFonts w:asciiTheme="majorHAnsi" w:eastAsiaTheme="majorEastAsia" w:hAnsiTheme="majorHAnsi" w:cstheme="majorBidi"/>
       <w:b/>
       <w:bCs/>
       <w:color w:val="365F91" w:themeColor="accent1" w:themeShade="BF"/>
@@ -1475,7 +1152,7 @@
       <w:outlineLvl w:val="1"/>
     </w:pPr>
     <w:rPr>
-      <w:rFonts w:asciiTheme="majorHAnsi" w:eastAsiaTheme="majorEastAsia" w:hAnsiTheme="majorHAnsi" w:cstheme="majorBidi" w:ascii="Arial" w:hAnsi="Arial" w:eastAsia="Arial"/>
+      <w:rFonts w:asciiTheme="majorHAnsi" w:eastAsiaTheme="majorEastAsia" w:hAnsiTheme="majorHAnsi" w:cstheme="majorBidi"/>
       <w:b/>
       <w:bCs/>
       <w:color w:val="4F81BD" w:themeColor="accent1"/>
@@ -1740,7 +1417,7 @@
       <w:contextualSpacing/>
     </w:pPr>
     <w:rPr>
-      <w:rFonts w:asciiTheme="majorHAnsi" w:eastAsiaTheme="majorEastAsia" w:hAnsiTheme="majorHAnsi" w:cstheme="majorBidi" w:ascii="Arial" w:hAnsi="Arial" w:eastAsia="Arial"/>
+      <w:rFonts w:asciiTheme="majorHAnsi" w:eastAsiaTheme="majorEastAsia" w:hAnsiTheme="majorHAnsi" w:cstheme="majorBidi"/>
       <w:color w:val="17365D" w:themeColor="text2" w:themeShade="BF"/>
       <w:spacing w:val="5"/>
       <w:kern w:val="28"/>

</xml_diff>